<commit_message>
tinh chỉnh tất cả
</commit_message>
<xml_diff>
--- a/van_ban_du_thao/2026/Bao_cao/TC03_BC_Tham_dinh_KH_Chuyen_doi_so.docx
+++ b/van_ban_du_thao/2026/Bao_cao/TC03_BC_Tham_dinh_KH_Chuyen_doi_so.docx
@@ -39,7 +39,7 @@
             <w:r>
               <w:rPr>
                 <w:rFonts w:ascii="Times New Roman" w:hAnsi="Times New Roman"/>
-                <w:sz w:val="26"/>
+                <w:sz w:val="28"/>
               </w:rPr>
               <w:t>ĐẢNG UỶ XÃ CÔNG HẢI</w:t>
             </w:r>
@@ -53,7 +53,7 @@
               <w:rPr>
                 <w:rFonts w:ascii="Times New Roman" w:hAnsi="Times New Roman"/>
                 <w:b/>
-                <w:sz w:val="26"/>
+                <w:sz w:val="28"/>
               </w:rPr>
               <w:t>VĂN PHÒNG</w:t>
             </w:r>
@@ -67,7 +67,7 @@
               <w:rPr>
                 <w:rFonts w:ascii="Times New Roman" w:hAnsi="Times New Roman"/>
                 <w:b/>
-                <w:sz w:val="24"/>
+                <w:sz w:val="28"/>
               </w:rPr>
               <w:t>*</w:t>
             </w:r>
@@ -80,7 +80,7 @@
             <w:r>
               <w:rPr>
                 <w:rFonts w:ascii="Times New Roman" w:hAnsi="Times New Roman"/>
-                <w:sz w:val="27"/>
+                <w:sz w:val="28"/>
               </w:rPr>
               <w:t>Số      -BC/VPĐU</w:t>
             </w:r>
@@ -117,7 +117,7 @@
             </w:pPr>
             <w:r>
               <w:pict>
-                <v:line from="0,0" to="186pt,0" strokecolor="#000000" strokeweight="0.75pt"/>
+                <v:line from="0,0" to="192pt,0" strokecolor="#000000" strokeweight="0.75pt"/>
               </w:pict>
             </w:r>
           </w:p>
@@ -130,7 +130,7 @@
               <w:rPr>
                 <w:rFonts w:ascii="Times New Roman" w:hAnsi="Times New Roman"/>
                 <w:i/>
-                <w:sz w:val="27"/>
+                <w:sz w:val="28"/>
               </w:rPr>
               <w:t>Công Hải, ngày   tháng   năm 2026</w:t>
             </w:r>

</xml_diff>